<commit_message>
feta: pregled 3 iteracije in dokončanje
</commit_message>
<xml_diff>
--- a/docs/reports/Iteracija_3_DotaOps_backend_pregled.docx
+++ b/docs/reports/Iteracija_3_DotaOps_backend_pregled.docx
@@ -158,17 +158,8 @@
             </w:tcMar>
           </w:tcPr>
           <w:p>
-            <w:pPr>
-              <w:spacing w:after="0" w:line="252" w:lineRule="auto"/>
-            </w:pPr>
-            <w:r/>
-            <w:r>
-              <w:rPr>
-                <w:rFonts w:ascii="Calibri" w:hAnsi="Calibri"/>
-                <w:b w:val="0"/>
-                <w:sz w:val="18"/>
-              </w:rPr>
-              <w:t>17. maj 2026</w:t>
+            <w:r>
+              <w:t>18. maj 2026</w:t>
             </w:r>
           </w:p>
         </w:tc>
@@ -1005,17 +996,8 @@
             </w:tcMar>
           </w:tcPr>
           <w:p>
-            <w:pPr>
-              <w:spacing w:after="0" w:line="252" w:lineRule="auto"/>
-            </w:pPr>
-            <w:r/>
-            <w:r>
-              <w:rPr>
-                <w:rFonts w:ascii="Calibri" w:hAnsi="Calibri"/>
-                <w:b w:val="0"/>
-                <w:sz w:val="16"/>
-              </w:rPr>
-              <w:t>286 testov, 0 failure, 0 error, 25 skipped</w:t>
+            <w:r>
+              <w:t>291 testov, 0 failure, 0 error, 26 skipped</w:t>
             </w:r>
           </w:p>
         </w:tc>
@@ -5868,6 +5850,38 @@
           </w:p>
         </w:tc>
       </w:tr>
+      <w:tr>
+        <w:tc>
+          <w:tcPr>
+            <w:tcW w:type="dxa" w:w="3389"/>
+          </w:tcPr>
+          <w:p>
+            <w:r>
+              <w:t>Organizer standings</w:t>
+            </w:r>
+          </w:p>
+        </w:tc>
+        <w:tc>
+          <w:tcPr>
+            <w:tcW w:type="dxa" w:w="3389"/>
+          </w:tcPr>
+          <w:p>
+            <w:r>
+              <w:t>GET /api/organizer/tournaments/{tournamentId}/standings vrne calculated standings tudi za private/draft turnir, po service preverjanju canManage.</w:t>
+            </w:r>
+          </w:p>
+        </w:tc>
+        <w:tc>
+          <w:tcPr>
+            <w:tcW w:type="dxa" w:w="3389"/>
+          </w:tcPr>
+          <w:p>
+            <w:r>
+              <w:t>TournamentGroupController, TournamentGroupService, TournamentGroupRepository</w:t>
+            </w:r>
+          </w:p>
+        </w:tc>
+      </w:tr>
     </w:tbl>
     <w:p>
       <w:pPr>
@@ -9968,17 +9982,8 @@
             </w:tcMar>
           </w:tcPr>
           <w:p>
-            <w:pPr>
-              <w:spacing w:after="0" w:line="252" w:lineRule="auto"/>
-            </w:pPr>
-            <w:r/>
-            <w:r>
-              <w:rPr>
-                <w:rFonts w:ascii="Calibri" w:hAnsi="Calibri"/>
-                <w:b w:val="0"/>
-                <w:sz w:val="14"/>
-              </w:rPr>
-              <w:t>GET/POST /api/organizer/tournaments/{id}/groups; GET /api/tournaments/{id}/groups; GET/POST/DELETE group teams; GET standings</w:t>
+            <w:r>
+              <w:t>GET/POST /api/organizer/tournaments/{id}/groups; GET /api/organizer/tournaments/{id}/standings; GET /api/tournaments/{id}/groups; GET/POST/DELETE group teams; GET standings</w:t>
             </w:r>
           </w:p>
         </w:tc>
@@ -9994,17 +9999,8 @@
             </w:tcMar>
           </w:tcPr>
           <w:p>
-            <w:pPr>
-              <w:spacing w:after="0" w:line="252" w:lineRule="auto"/>
-            </w:pPr>
-            <w:r/>
-            <w:r>
-              <w:rPr>
-                <w:rFonts w:ascii="Calibri" w:hAnsi="Calibri"/>
-                <w:b w:val="0"/>
-                <w:sz w:val="14"/>
-              </w:rPr>
-              <w:t>Organizer write, public read, approved registration validation.</w:t>
+            <w:r>
+              <w:t>Organizer write/read, organizer private standings, public read, approved registration validation.</w:t>
             </w:r>
           </w:p>
         </w:tc>
@@ -10499,17 +10495,8 @@
             </w:tcMar>
           </w:tcPr>
           <w:p>
-            <w:pPr>
-              <w:spacing w:after="0" w:line="252" w:lineRule="auto"/>
-            </w:pPr>
-            <w:r/>
-            <w:r>
-              <w:rPr>
-                <w:rFonts w:ascii="Calibri" w:hAnsi="Calibri"/>
-                <w:b w:val="0"/>
-                <w:sz w:val="15"/>
-              </w:rPr>
-              <w:t>BUILD SUCCESS; 286 tests, 0 failures, 0 errors, 25 skipped</w:t>
+            <w:r>
+              <w:t>BUILD SUCCESS; 291 tests, 0 failures, 0 errors, 26 skipped</w:t>
             </w:r>
           </w:p>
         </w:tc>
@@ -10525,17 +10512,8 @@
             </w:tcMar>
           </w:tcPr>
           <w:p>
-            <w:pPr>
-              <w:spacing w:after="0" w:line="252" w:lineRule="auto"/>
-            </w:pPr>
-            <w:r/>
-            <w:r>
-              <w:rPr>
-                <w:rFonts w:ascii="Calibri" w:hAnsi="Calibri"/>
-                <w:b w:val="0"/>
-                <w:sz w:val="15"/>
-              </w:rPr>
-              <w:t>Pognano 17. maja 2026 v C:\DataOpsProjekt\DotaOps\backend.</w:t>
+            <w:r>
+              <w:t>Pognano 18. maja 2026 v C:\DataOpsProjekt\DotaOps\backend.</w:t>
             </w:r>
           </w:p>
         </w:tc>
@@ -10699,6 +10677,38 @@
                 <w:sz w:val="15"/>
               </w:rPr>
               <w:t>Preverjeno v backend/src/main/resources/db/migration.</w:t>
+            </w:r>
+          </w:p>
+        </w:tc>
+      </w:tr>
+      <w:tr>
+        <w:tc>
+          <w:tcPr>
+            <w:tcW w:type="dxa" w:w="3389"/>
+          </w:tcPr>
+          <w:p>
+            <w:r>
+              <w:t>.\mvnw.cmd "-Dtest=TournamentGroupServiceTest,TournamentGroupControllerTest,TournamentGroupStandingsIntegrationTest" test "-Dspring.profiles.active=test"</w:t>
+            </w:r>
+          </w:p>
+        </w:tc>
+        <w:tc>
+          <w:tcPr>
+            <w:tcW w:type="dxa" w:w="3389"/>
+          </w:tcPr>
+          <w:p>
+            <w:r>
+              <w:t>BUILD SUCCESS; 18 tests, 0 failures, 0 errors, 3 skipped</w:t>
+            </w:r>
+          </w:p>
+        </w:tc>
+        <w:tc>
+          <w:tcPr>
+            <w:tcW w:type="dxa" w:w="3389"/>
+          </w:tcPr>
+          <w:p>
+            <w:r>
+              <w:t>Ciljni testi za group/standings dopolnitev; Postgres integration testi so lokalno skipped brez SUPABASE_DB_URL.</w:t>
             </w:r>
           </w:p>
         </w:tc>
@@ -10959,17 +10969,8 @@
             </w:tcMar>
           </w:tcPr>
           <w:p>
-            <w:pPr>
-              <w:spacing w:after="0" w:line="252" w:lineRule="auto"/>
-            </w:pPr>
-            <w:r/>
-            <w:r>
-              <w:rPr>
-                <w:rFonts w:ascii="Calibri" w:hAnsi="Calibri"/>
-                <w:b w:val="0"/>
-                <w:sz w:val="15"/>
-              </w:rPr>
-              <w:t>Permissioni, approved registration pravilo, group assignment, standings view.</w:t>
+            <w:r>
+              <w:t>Permissioni, approved registration pravilo, group assignment, public standings view in organizer private standings query.</w:t>
             </w:r>
           </w:p>
         </w:tc>
@@ -12253,6 +12254,48 @@
                 <w:sz w:val="14"/>
               </w:rPr>
               <w:t>Za več instanc bo potreben Redis/gateway rate limit.</w:t>
+            </w:r>
+          </w:p>
+        </w:tc>
+      </w:tr>
+      <w:tr>
+        <w:tc>
+          <w:tcPr>
+            <w:tcW w:type="dxa" w:w="2541"/>
+          </w:tcPr>
+          <w:p>
+            <w:r>
+              <w:t>Ne dodajamo future-scope endpointov</w:t>
+            </w:r>
+          </w:p>
+        </w:tc>
+        <w:tc>
+          <w:tcPr>
+            <w:tcW w:type="dxa" w:w="2541"/>
+          </w:tcPr>
+          <w:p>
+            <w:r>
+              <w:t>Dodana je samo organizer standings pot; auto-generate groups, bulk seed, export, recalculate, manual tie-break override in staff CRUD ostanejo izven trenutnega scope-a.</w:t>
+            </w:r>
+          </w:p>
+        </w:tc>
+        <w:tc>
+          <w:tcPr>
+            <w:tcW w:type="dxa" w:w="2541"/>
+          </w:tcPr>
+          <w:p>
+            <w:r>
+              <w:t>FE-07 jih trenutno uporablja kot disabled placeholderje ali prihodnje ideje, zato backend ne potrebuje neuporabljene kode.</w:t>
+            </w:r>
+          </w:p>
+        </w:tc>
+        <w:tc>
+          <w:tcPr>
+            <w:tcW w:type="dxa" w:w="2541"/>
+          </w:tcPr>
+          <w:p>
+            <w:r>
+              <w:t>Manj neuporabljene povr?ine, jasnej?i API in la?je nadaljevanje v naslednjih iteracijah.</w:t>
             </w:r>
           </w:p>
         </w:tc>
@@ -12304,7 +12347,7 @@
         <w:spacing w:after="60"/>
       </w:pPr>
       <w:r>
-        <w:t>Referee/analyst pravice se lahko dodajo nad obstoječim match management service vzorcem, vendar morajo ostati resource-scoped.</w:t>
+        <w:t>Referee/analyst ali score reporter pravice se lahko dodajo nad obstoje?im match management service vzorcem, vendar morajo ostati tournament/resource-scoped in ne globalne login vloge.</w:t>
       </w:r>
     </w:p>
     <w:p>
@@ -12530,16 +12573,7 @@
             </w:tcMar>
           </w:tcPr>
           <w:p>
-            <w:pPr>
-              <w:spacing w:after="0" w:line="252" w:lineRule="auto"/>
-            </w:pPr>
-            <w:r/>
-            <w:r>
-              <w:rPr>
-                <w:rFonts w:ascii="Calibri" w:hAnsi="Calibri"/>
-                <w:b w:val="0"/>
-                <w:sz w:val="15"/>
-              </w:rPr>
+            <w:r>
               <w:t>Integration testi z realno Supabase/PostgreSQL bazo niso pognani v tem lokalnem passu</w:t>
             </w:r>
           </w:p>
@@ -12557,17 +12591,8 @@
             </w:tcMar>
           </w:tcPr>
           <w:p>
-            <w:pPr>
-              <w:spacing w:after="0" w:line="252" w:lineRule="auto"/>
-            </w:pPr>
-            <w:r/>
-            <w:r>
-              <w:rPr>
-                <w:rFonts w:ascii="Calibri" w:hAnsi="Calibri"/>
-                <w:b w:val="0"/>
-                <w:sz w:val="15"/>
-              </w:rPr>
-              <w:t>Pognan je bil test profil; 25 testov je skipped.</w:t>
+            <w:r>
+              <w:t>Pognan je bil test profil; 26 testov je skipped.</w:t>
             </w:r>
           </w:p>
         </w:tc>
@@ -12938,17 +12963,8 @@
             </w:tcMar>
           </w:tcPr>
           <w:p>
-            <w:pPr>
-              <w:spacing w:after="0" w:line="252" w:lineRule="auto"/>
-            </w:pPr>
-            <w:r/>
-            <w:r>
-              <w:rPr>
-                <w:rFonts w:ascii="Calibri" w:hAnsi="Calibri"/>
-                <w:b w:val="0"/>
-                <w:sz w:val="15"/>
-              </w:rPr>
-              <w:t>Referee/analyst write flow še ni polno odprt</w:t>
+            <w:r>
+              <w:t>Staff/referee/analyst flow ?e ni odprt kot samostojen backend scope</w:t>
             </w:r>
           </w:p>
         </w:tc>
@@ -12964,17 +12980,8 @@
             </w:tcMar>
           </w:tcPr>
           <w:p>
-            <w:pPr>
-              <w:spacing w:after="0" w:line="252" w:lineRule="auto"/>
-            </w:pPr>
-            <w:r/>
-            <w:r>
-              <w:rPr>
-                <w:rFonts w:ascii="Calibri" w:hAnsi="Calibri"/>
-                <w:b w:val="0"/>
-                <w:sz w:val="15"/>
-              </w:rPr>
-              <w:t>BE/DB-13 iz 2. iteracije je bil deferiran in 3. iteracija ga ni širila.</w:t>
+            <w:r>
+              <w:t>FE-06 je poenostavljen na organizer-controlled operations; globalnih referee/analyst login vlog backend namenoma ne dodaja.</w:t>
             </w:r>
           </w:p>
         </w:tc>
@@ -12990,17 +12997,8 @@
             </w:tcMar>
           </w:tcPr>
           <w:p>
-            <w:pPr>
-              <w:spacing w:after="0" w:line="252" w:lineRule="auto"/>
-            </w:pPr>
-            <w:r/>
-            <w:r>
-              <w:rPr>
-                <w:rFonts w:ascii="Calibri" w:hAnsi="Calibri"/>
-                <w:b w:val="0"/>
-                <w:sz w:val="15"/>
-              </w:rPr>
-              <w:t>Dodati šele ob jasni permission specifikaciji.</w:t>
+            <w:r>
+              <w:t>Dodati ?ele ob jasni tournament-scoped permission specifikaciji.</w:t>
             </w:r>
           </w:p>
         </w:tc>
@@ -13033,7 +13031,7 @@
         <w:spacing w:after="120" w:line="259" w:lineRule="auto"/>
       </w:pPr>
       <w:r>
-        <w:t>Arhitektura je ostala konsistentna s prejšnjima iteracijama. Največ novega dela je v tournament service/repository sloju in v Flyway migracijah V15-V19. Lokalni testni ukaz v test profilu je uspešno zaključen, kar daje dobro osnovo za nadaljevanje frontend integracije in dodatnih organizer/referee workflowov.</w:t>
+        <w:t>Arhitektura je ostala konsistentna s prej?njima iteracijama. Najve? novega dela je v tournament service/repository sloju in v Flyway migracijah V15-V19. Lokalni testni ukaz v test profilu je uspe?no zaklju?en, kar daje dobro osnovo za nadaljevanje frontend integracije in dodatnih organizer-scoped workflowov.</w:t>
       </w:r>
     </w:p>
     <w:p>
@@ -13664,6 +13662,28 @@
                 <w:sz w:val="15"/>
               </w:rPr>
               <w:t>Projektna pravila za backend, migracije, varnost in reporting.</w:t>
+            </w:r>
+          </w:p>
+        </w:tc>
+      </w:tr>
+      <w:tr>
+        <w:tc>
+          <w:tcPr>
+            <w:tcW w:type="dxa" w:w="5083"/>
+          </w:tcPr>
+          <w:p>
+            <w:r>
+              <w:t>FE-06/FE-07 backend preverjanje</w:t>
+            </w:r>
+          </w:p>
+        </w:tc>
+        <w:tc>
+          <w:tcPr>
+            <w:tcW w:type="dxa" w:w="5083"/>
+          </w:tcPr>
+          <w:p>
+            <w:r>
+              <w:t>Preverjen je frontend seznam uporabljenih endpointov; implementiran je samo manjkajo?i organizer standings endpoint.</w:t>
             </w:r>
           </w:p>
         </w:tc>

</xml_diff>